<commit_message>
Update - commit - documents- 9/5/2026
</commit_message>
<xml_diff>
--- a/document/SCI_SE_12.ProjectConfigurationManagement.docx
+++ b/document/SCI_SE_12.ProjectConfigurationManagement.docx
@@ -20355,12 +20355,12 @@
     </w:p>
     <w:p>
       <w:pPr>
-        <w:pStyle w:val="ListParagraph"/>
         <w:numPr>
           <w:ilvl w:val="0"/>
-          <w:numId w:val="11"/>
+          <w:numId w:val="15"/>
         </w:numPr>
         <w:spacing w:before="100" w:beforeAutospacing="1" w:after="100" w:afterAutospacing="1" w:line="276" w:lineRule="auto"/>
+        <w:jc w:val="center"/>
         <w:rPr>
           <w:rFonts w:ascii="Times New Roman" w:hAnsi="Times New Roman" w:cs="Times New Roman"/>
           <w:iCs/>
@@ -20390,17 +20390,17 @@
           <w:lang w:val="en-US"/>
         </w:rPr>
         <w:tab/>
-        <w:t xml:space="preserve">                  -   28211153732</w:t>
+        <w:t xml:space="preserve">                   -   28211153732</w:t>
       </w:r>
     </w:p>
     <w:p>
       <w:pPr>
-        <w:pStyle w:val="ListParagraph"/>
         <w:numPr>
           <w:ilvl w:val="0"/>
-          <w:numId w:val="11"/>
+          <w:numId w:val="15"/>
         </w:numPr>
         <w:spacing w:before="100" w:beforeAutospacing="1" w:after="100" w:afterAutospacing="1" w:line="276" w:lineRule="auto"/>
+        <w:jc w:val="center"/>
         <w:rPr>
           <w:rFonts w:ascii="Times New Roman" w:hAnsi="Times New Roman" w:cs="Times New Roman"/>
           <w:iCs/>
@@ -20417,17 +20417,17 @@
           <w:szCs w:val="28"/>
           <w:lang w:val="en-US"/>
         </w:rPr>
-        <w:t>Trương Văn Vũ                  -  28210236758</w:t>
+        <w:t>Trương Văn Vũ                   -  28210236758</w:t>
       </w:r>
     </w:p>
     <w:p>
       <w:pPr>
-        <w:pStyle w:val="ListParagraph"/>
         <w:numPr>
           <w:ilvl w:val="0"/>
-          <w:numId w:val="11"/>
+          <w:numId w:val="15"/>
         </w:numPr>
         <w:spacing w:before="100" w:beforeAutospacing="1" w:after="100" w:afterAutospacing="1" w:line="276" w:lineRule="auto"/>
+        <w:jc w:val="center"/>
         <w:rPr>
           <w:rFonts w:ascii="Times New Roman" w:hAnsi="Times New Roman" w:cs="Times New Roman"/>
           <w:iCs/>
@@ -20455,17 +20455,17 @@
           <w:lang w:val="en-US"/>
         </w:rPr>
         <w:tab/>
-        <w:t xml:space="preserve">        - 28204631272</w:t>
+        <w:t xml:space="preserve">         - 28204631272</w:t>
       </w:r>
     </w:p>
     <w:p>
       <w:pPr>
-        <w:pStyle w:val="ListParagraph"/>
         <w:numPr>
           <w:ilvl w:val="0"/>
-          <w:numId w:val="11"/>
+          <w:numId w:val="15"/>
         </w:numPr>
         <w:spacing w:before="100" w:beforeAutospacing="1" w:after="100" w:afterAutospacing="1" w:line="276" w:lineRule="auto"/>
+        <w:jc w:val="center"/>
         <w:rPr>
           <w:rFonts w:ascii="Times New Roman" w:hAnsi="Times New Roman" w:cs="Times New Roman"/>
           <w:iCs/>
@@ -20482,17 +20482,17 @@
           <w:szCs w:val="28"/>
           <w:lang w:val="en-US"/>
         </w:rPr>
-        <w:t>Nguyễn Diệp Thanh Bình   -  28211127934</w:t>
+        <w:t>Nguyễn Diệp Thanh Bình    -  28211127934</w:t>
       </w:r>
     </w:p>
     <w:p>
       <w:pPr>
-        <w:pStyle w:val="ListParagraph"/>
         <w:numPr>
           <w:ilvl w:val="0"/>
-          <w:numId w:val="11"/>
+          <w:numId w:val="15"/>
         </w:numPr>
         <w:spacing w:before="100" w:beforeAutospacing="1" w:after="100" w:afterAutospacing="1" w:line="276" w:lineRule="auto"/>
+        <w:jc w:val="center"/>
         <w:rPr>
           <w:rFonts w:ascii="Times New Roman" w:hAnsi="Times New Roman" w:cs="Times New Roman"/>
           <w:iCs/>
@@ -20509,13 +20509,26 @@
           <w:szCs w:val="28"/>
           <w:lang w:val="en-US"/>
         </w:rPr>
-        <w:t>Ngô Quang Duy                  -  28210203474</w:t>
+        <w:t>Ngô Quang Duy                   -  28210203474</w:t>
       </w:r>
     </w:p>
     <w:p>
       <w:pPr>
         <w:spacing w:before="100" w:beforeAutospacing="1" w:after="100" w:afterAutospacing="1" w:line="276" w:lineRule="auto"/>
-        <w:jc w:val="center"/>
+        <w:rPr>
+          <w:rFonts w:ascii="Times New Roman" w:hAnsi="Times New Roman" w:cs="Times New Roman"/>
+          <w:b/>
+          <w:bCs/>
+          <w:iCs/>
+          <w:sz w:val="30"/>
+          <w:szCs w:val="30"/>
+          <w:lang w:val="en-US"/>
+        </w:rPr>
+      </w:pPr>
+    </w:p>
+    <w:p>
+      <w:pPr>
+        <w:spacing w:before="100" w:beforeAutospacing="1" w:after="100" w:afterAutospacing="1" w:line="276" w:lineRule="auto"/>
         <w:rPr>
           <w:rFonts w:ascii="Times New Roman" w:hAnsi="Times New Roman" w:cs="Times New Roman"/>
           <w:b/>
@@ -20538,18 +20551,6 @@
         </w:rPr>
         <w:t xml:space="preserve">                                                Đà Nẵng, 2026</w:t>
       </w:r>
-    </w:p>
-    <w:p>
-      <w:pPr>
-        <w:spacing w:line="276" w:lineRule="auto"/>
-        <w:rPr>
-          <w:rFonts w:ascii="Times New Roman" w:eastAsia="Times New Roman" w:hAnsi="Times New Roman" w:cs="Times New Roman"/>
-          <w:b/>
-          <w:bCs/>
-          <w:sz w:val="32"/>
-          <w:szCs w:val="32"/>
-        </w:rPr>
-      </w:pPr>
       <w:r>
         <w:rPr>
           <w:rFonts w:ascii="Times New Roman" w:eastAsia="Times New Roman" w:hAnsi="Times New Roman" w:cs="Times New Roman"/>
@@ -27351,6 +27352,7 @@
       </w:tr>
       <w:tr>
         <w:trPr>
+          <w:trHeight w:val="774"/>
           <w:jc w:val="center"/>
         </w:trPr>
         <w:tc>
@@ -27409,16 +27411,6 @@
               </w:rPr>
               <w:t xml:space="preserve"> Tất cả các hình ảnh phải được đánh dấu tên để dễ tìm kiếm và người dùng sẽ hiểu.</w:t>
             </w:r>
-          </w:p>
-          <w:p>
-            <w:pPr>
-              <w:spacing w:line="360" w:lineRule="auto"/>
-              <w:rPr>
-                <w:rFonts w:ascii="Times New Roman" w:hAnsi="Times New Roman" w:cs="Times New Roman"/>
-                <w:sz w:val="26"/>
-                <w:szCs w:val="26"/>
-              </w:rPr>
-            </w:pPr>
           </w:p>
         </w:tc>
         <w:tc>
@@ -28385,11 +28377,19 @@
     <w:r>
       <w:rPr>
         <w:rFonts w:ascii="Times New Roman" w:eastAsia="Times New Roman" w:hAnsi="Times New Roman" w:cs="Times New Roman"/>
+        <w:sz w:val="26"/>
+        <w:szCs w:val="26"/>
+      </w:rPr>
+      <w:t xml:space="preserve">Configuration management </w:t>
+    </w:r>
+    <w:r>
+      <w:rPr>
+        <w:rFonts w:ascii="Times New Roman" w:eastAsia="Times New Roman" w:hAnsi="Times New Roman" w:cs="Times New Roman"/>
         <w:color w:val="000000"/>
         <w:sz w:val="26"/>
         <w:szCs w:val="26"/>
       </w:rPr>
-      <w:t>Plan Document</w:t>
+      <w:t>Document</w:t>
     </w:r>
     <w:r>
       <w:rPr>
@@ -30104,6 +30104,36 @@
   <w:num w:numId="14" w16cid:durableId="491214119">
     <w:abstractNumId w:val="2"/>
   </w:num>
+  <w:num w:numId="15" w16cid:durableId="1192378830">
+    <w:abstractNumId w:val="4"/>
+    <w:lvlOverride w:ilvl="0">
+      <w:startOverride w:val="1"/>
+    </w:lvlOverride>
+    <w:lvlOverride w:ilvl="1">
+      <w:startOverride w:val="1"/>
+    </w:lvlOverride>
+    <w:lvlOverride w:ilvl="2">
+      <w:startOverride w:val="1"/>
+    </w:lvlOverride>
+    <w:lvlOverride w:ilvl="3">
+      <w:startOverride w:val="1"/>
+    </w:lvlOverride>
+    <w:lvlOverride w:ilvl="4">
+      <w:startOverride w:val="1"/>
+    </w:lvlOverride>
+    <w:lvlOverride w:ilvl="5">
+      <w:startOverride w:val="1"/>
+    </w:lvlOverride>
+    <w:lvlOverride w:ilvl="6">
+      <w:startOverride w:val="1"/>
+    </w:lvlOverride>
+    <w:lvlOverride w:ilvl="7">
+      <w:startOverride w:val="1"/>
+    </w:lvlOverride>
+    <w:lvlOverride w:ilvl="8">
+      <w:startOverride w:val="1"/>
+    </w:lvlOverride>
+  </w:num>
 </w:numbering>
 </file>
 
@@ -30721,7 +30751,6 @@
   <w:style w:type="character" w:default="1" w:styleId="DefaultParagraphFont">
     <w:name w:val="Default Paragraph Font"/>
     <w:uiPriority w:val="1"/>
-    <w:semiHidden/>
     <w:unhideWhenUsed/>
   </w:style>
   <w:style w:type="table" w:default="1" w:styleId="TableNormal">

</xml_diff>